<commit_message>
Add presenter script: speaker notes in deck, presenter panel on page (press P), Markdown script; fix stale 87% lines
Co-Authored-By: Claude Sonnet 5.5 <noreply@anthropic.com>
Claude-Session: https://claude.ai/code/session_01FAENrzfsgymASTKbqkMwKA
</commit_message>
<xml_diff>
--- a/examples/Stochastic_SPM_Run_of_Show.docx
+++ b/examples/Stochastic_SPM_Run_of_Show.docx
@@ -2049,7 +2049,7 @@
           <w:i/>
           <w:iCs/>
         </w:rPr>
-        <w:t>“Chasing fourteen project owners for updates. Reconciling conflicting budget spreadsheets. Rebuilding the steering deck from scratch, again. Re-keying resourcing data by hand from four different calendars. Add it up, and eighty-seven percent of a forty-hour week goes to manufacturing clarity — not exercising judgment.”</w:t>
+        <w:t>“Chasing fourteen project owners for updates. Reconciling conflicting budget spreadsheets. Rebuilding the steering deck from scratch, again. Re-keying resourcing data by hand from four different calendars. Then the ad hoc requests — 'can you pull that number again?' Add it up, and ninety-one percent of a forty-hour week goes to manufacturing clarity — not exercising judgment.”</w:t>
       </w:r>
     </w:p>
     <w:p>
@@ -2112,7 +2112,7 @@
           <w:i/>
           <w:iCs/>
         </w:rPr>
-        <w:t>“So the question isn't whether this person is capable. It's whether we're spending her time on the right eighty-seven percent. Let's look at what changes when AI does the assembly work instead of her.”</w:t>
+        <w:t>“So the question isn't whether this person is capable. It's whether we're spending her time on the right ninety-one percent. Let's look at what changes when AI does the assembly work instead of her.”</w:t>
       </w:r>
     </w:p>
     <w:p>

</xml_diff>

<commit_message>
Add click paths to presenter notes, deck speaker notes and script
Co-Authored-By: Claude Sonnet 5.5 <noreply@anthropic.com>
Claude-Session: https://claude.ai/code/session_01FAENrzfsgymASTKbqkMwKA
</commit_message>
<xml_diff>
--- a/examples/Stochastic_SPM_Run_of_Show.docx
+++ b/examples/Stochastic_SPM_Run_of_Show.docx
@@ -1910,6 +1910,23 @@
     </w:p>
     <w:p>
       <w:pPr>
+        <w:spacing w:after="140"/>
+        <w:ind w:left="360"/>
+      </w:pPr>
+      <w:r>
+        <w:rPr>
+          <w:b/>
+          <w:bCs/>
+          <w:color w:val="B8720C"/>
+        </w:rPr>
+        <w:t xml:space="preserve">CLICK: </w:t>
+      </w:r>
+      <w:r>
+        <w:t>(Page version) Click the ACT I tab. Point to: the three red stat cards (62%, 11 days, 3), then the Master Tracker table - the struck-through "on track" note on Core Billing and the red flag on Fraud Detection. Then click Next Act.</w:t>
+      </w:r>
+    </w:p>
+    <w:p>
+      <w:pPr>
         <w:spacing w:after="100"/>
         <w:ind w:left="360"/>
       </w:pPr>
@@ -2033,6 +2050,23 @@
     </w:p>
     <w:p>
       <w:pPr>
+        <w:spacing w:after="140"/>
+        <w:ind w:left="360"/>
+      </w:pPr>
+      <w:r>
+        <w:rPr>
+          <w:b/>
+          <w:bCs/>
+          <w:color w:val="B8720C"/>
+        </w:rPr>
+        <w:t xml:space="preserve">CLICK: </w:t>
+      </w:r>
+      <w:r>
+        <w:t>(Page version) Click the ACT II tab. Point to: the doughnut on the left (the small teal slice is the 3.5 hours left for judgment), then read down the task queue on the right to the bold last line.</w:t>
+      </w:r>
+    </w:p>
+    <w:p>
+      <w:pPr>
         <w:spacing w:after="100"/>
         <w:ind w:left="360"/>
       </w:pPr>
@@ -2156,6 +2190,23 @@
     </w:p>
     <w:p>
       <w:pPr>
+        <w:spacing w:after="140"/>
+        <w:ind w:left="360"/>
+      </w:pPr>
+      <w:r>
+        <w:rPr>
+          <w:b/>
+          <w:bCs/>
+          <w:color w:val="B8720C"/>
+        </w:rPr>
+        <w:t xml:space="preserve">CLICK: </w:t>
+      </w:r>
+      <w:r>
+        <w:t>Click the ACT III tab (0:16–0:44). The seven pillar tabs run left to right: P01 Strategic Allocation, P02 Capacity &amp; Queuing, P03 Delivery Risk, P04 SPC Control, P05 Talent Elevation, P06 Financial Precision, P07 Outcome Twin. Press P to show or hide this panel.</w:t>
+      </w:r>
+    </w:p>
+    <w:p>
+      <w:pPr>
         <w:spacing w:after="100"/>
         <w:ind w:left="360"/>
       </w:pPr>
@@ -2207,6 +2258,23 @@
     </w:p>
     <w:p>
       <w:pPr>
+        <w:spacing w:after="140"/>
+        <w:ind w:left="360"/>
+      </w:pPr>
+      <w:r>
+        <w:rPr>
+          <w:b/>
+          <w:bCs/>
+          <w:color w:val="B8720C"/>
+        </w:rPr>
+        <w:t xml:space="preserve">CLICK: </w:t>
+      </w:r>
+      <w:r>
+        <w:t>Click ACT III, then the P01 Strategic Allocation tab. Point to: the two amber drift callouts on the left (LATAM 0.71, Legacy CRM 0.58), then the bubble chart on the right - the teal cloud-infrastructure cluster and the violet vendor cluster.</w:t>
+      </w:r>
+    </w:p>
+    <w:p>
+      <w:pPr>
         <w:spacing w:after="100"/>
         <w:ind w:left="360"/>
       </w:pPr>
@@ -2321,6 +2389,23 @@
     </w:p>
     <w:p>
       <w:pPr>
+        <w:spacing w:after="140"/>
+        <w:ind w:left="360"/>
+      </w:pPr>
+      <w:r>
+        <w:rPr>
+          <w:b/>
+          <w:bCs/>
+          <w:color w:val="B8720C"/>
+        </w:rPr>
+        <w:t xml:space="preserve">CLICK: </w:t>
+      </w:r>
+      <w:r>
+        <w:t>Click the P02 Capacity &amp; Queuing tab. Point to: the Erlang curve on the left - follow it up to the knee at about 80-84% utilization - then the red "Threshold breached" card on the right: the 84% callout, then the forecast callout (3.1 days to 11.4 days).</w:t>
+      </w:r>
+    </w:p>
+    <w:p>
+      <w:pPr>
         <w:spacing w:after="100"/>
         <w:ind w:left="360"/>
       </w:pPr>
@@ -2414,6 +2499,23 @@
     </w:p>
     <w:p>
       <w:pPr>
+        <w:spacing w:after="140"/>
+        <w:ind w:left="360"/>
+      </w:pPr>
+      <w:r>
+        <w:rPr>
+          <w:b/>
+          <w:bCs/>
+          <w:color w:val="B8720C"/>
+        </w:rPr>
+        <w:t xml:space="preserve">CLICK: </w:t>
+      </w:r>
+      <w:r>
+        <w:t>Click the P03 Delivery Risk tab. Point to: the Monte Carlo fan on the left (the shaded band is the P10-P90 range, the line is the median path), then the completion curve on the right - first Aug 15 (22%), then Sep 30 (85%) - and finish on the callout under the curve.</w:t>
+      </w:r>
+    </w:p>
+    <w:p>
+      <w:pPr>
         <w:spacing w:after="100"/>
         <w:ind w:left="360"/>
       </w:pPr>
@@ -2528,6 +2630,23 @@
     </w:p>
     <w:p>
       <w:pPr>
+        <w:spacing w:after="140"/>
+        <w:ind w:left="360"/>
+      </w:pPr>
+      <w:r>
+        <w:rPr>
+          <w:b/>
+          <w:bCs/>
+          <w:color w:val="B8720C"/>
+        </w:rPr>
+        <w:t xml:space="preserve">CLICK: </w:t>
+      </w:r>
+      <w:r>
+        <w:t>Click the P04 SPC Control tab. Read the "Reporting tells you a number changed" callout first, then trace the velocity line to the amber point at Sprint 12 above the red UCL. The red dashed lines are the control limits (UCL 48, LCL 36). Finish on the callout at the bottom.</w:t>
+      </w:r>
+    </w:p>
+    <w:p>
+      <w:pPr>
         <w:spacing w:after="100"/>
         <w:ind w:left="360"/>
       </w:pPr>
@@ -2663,6 +2782,23 @@
     </w:p>
     <w:p>
       <w:pPr>
+        <w:spacing w:after="140"/>
+        <w:ind w:left="360"/>
+      </w:pPr>
+      <w:r>
+        <w:rPr>
+          <w:b/>
+          <w:bCs/>
+          <w:color w:val="B8720C"/>
+        </w:rPr>
+        <w:t xml:space="preserve">CLICK: </w:t>
+      </w:r>
+      <w:r>
+        <w:t>Click the P05 Talent Elevation tab. Point to: the adoption-gap bars at the top (teal = high adoption, grey = low), then the estimation-error chart on the lower left - the one amber bar is T. Brooks - and finish on the live nudge callout on the lower right.</w:t>
+      </w:r>
+    </w:p>
+    <w:p>
+      <w:pPr>
         <w:spacing w:after="100"/>
         <w:ind w:left="360"/>
       </w:pPr>
@@ -2819,6 +2955,23 @@
     </w:p>
     <w:p>
       <w:pPr>
+        <w:spacing w:after="140"/>
+        <w:ind w:left="360"/>
+      </w:pPr>
+      <w:r>
+        <w:rPr>
+          <w:b/>
+          <w:bCs/>
+          <w:color w:val="B8720C"/>
+        </w:rPr>
+        <w:t xml:space="preserve">CLICK: </w:t>
+      </w:r>
+      <w:r>
+        <w:t>Click the P06 Financial Precision tab. Point to: the EAC band narrowing across the eight sprints on the left, then the NPV ($2.4M) and IRR (18.6%) tiles with their confidence intervals, and finish on the governance-trigger callout.</w:t>
+      </w:r>
+    </w:p>
+    <w:p>
+      <w:pPr>
         <w:spacing w:after="100"/>
         <w:ind w:left="360"/>
       </w:pPr>
@@ -2912,6 +3065,23 @@
     </w:p>
     <w:p>
       <w:pPr>
+        <w:spacing w:after="140"/>
+        <w:ind w:left="360"/>
+      </w:pPr>
+      <w:r>
+        <w:rPr>
+          <w:b/>
+          <w:bCs/>
+          <w:color w:val="B8720C"/>
+        </w:rPr>
+        <w:t xml:space="preserve">CLICK: </w:t>
+      </w:r>
+      <w:r>
+        <w:t>Click the P07 Outcome Twin tab. Point to: the two outcome callouts on the left ($410K exposure, $1.2M protected), then the causal chart on the right - the gap between the treated cohort and the synthetic control after the Q3 launch - and finish on the +4.1pt callout.</w:t>
+      </w:r>
+    </w:p>
+    <w:p>
+      <w:pPr>
         <w:spacing w:after="100"/>
         <w:ind w:left="360"/>
       </w:pPr>
@@ -3071,6 +3241,23 @@
     </w:p>
     <w:p>
       <w:pPr>
+        <w:spacing w:after="140"/>
+        <w:ind w:left="360"/>
+      </w:pPr>
+      <w:r>
+        <w:rPr>
+          <w:b/>
+          <w:bCs/>
+          <w:color w:val="B8720C"/>
+        </w:rPr>
+        <w:t xml:space="preserve">CLICK: </w:t>
+      </w:r>
+      <w:r>
+        <w:t>(Page version) Click the ACT IV tab. Point to: the three green stat cards left to right (6.2x, 91%, 31.5 hrs), then the Decision Velocity chart - grey Before bars against teal After bars.</w:t>
+      </w:r>
+    </w:p>
+    <w:p>
+      <w:pPr>
         <w:spacing w:after="100"/>
         <w:ind w:left="360"/>
       </w:pPr>
@@ -3148,6 +3335,23 @@
       </w:r>
       <w:r>
         <w:t>Advance to Slide 11. Read the closing quote slowly — it's designed to land as the answer to the Act I quote.</w:t>
+      </w:r>
+    </w:p>
+    <w:p>
+      <w:pPr>
+        <w:spacing w:after="140"/>
+        <w:ind w:left="360"/>
+      </w:pPr>
+      <w:r>
+        <w:rPr>
+          <w:b/>
+          <w:bCs/>
+          <w:color w:val="B8720C"/>
+        </w:rPr>
+        <w:t xml:space="preserve">CLICK: </w:t>
+      </w:r>
+      <w:r>
+        <w:t>(Page version) Click the ACT V tab. Point to: the adoption curve on the left, then the Program Scorecard on the right, and read the closing quote at the bottom slowly.</w:t>
       </w:r>
     </w:p>
     <w:p>

</xml_diff>